<commit_message>
Update mockups and final document without favorites
</commit_message>
<xml_diff>
--- a/data/Documento-final-2408d1.docx
+++ b/data/Documento-final-2408d1.docx
@@ -1,6 +1,6 @@
 
 <file path=word/document.xml><?xml version="1.0" encoding="utf-8"?>
-<w:document xmlns:wpc="http://schemas.microsoft.com/office/word/2010/wordprocessingCanvas" xmlns:cx="http://schemas.microsoft.com/office/drawing/2014/chartex" xmlns:mc="http://schemas.openxmlformats.org/markup-compatibility/2006" xmlns:o="urn:schemas-microsoft-com:office:office" xmlns:r="http://schemas.openxmlformats.org/officeDocument/2006/relationships" xmlns:m="http://schemas.openxmlformats.org/officeDocument/2006/math" xmlns:v="urn:schemas-microsoft-com:vml" xmlns:wp14="http://schemas.microsoft.com/office/word/2010/wordprocessingDrawing" xmlns:wp="http://schemas.openxmlformats.org/drawingml/2006/wordprocessingDrawing" xmlns:w10="urn:schemas-microsoft-com:office:word" xmlns:w="http://schemas.openxmlformats.org/wordprocessingml/2006/main" xmlns:w14="http://schemas.microsoft.com/office/word/2010/wordml" xmlns:w15="http://schemas.microsoft.com/office/word/2012/wordml" xmlns:w16se="http://schemas.microsoft.com/office/word/2015/wordml/symex" xmlns:wpg="http://schemas.microsoft.com/office/word/2010/wordprocessingGroup" xmlns:wpi="http://schemas.microsoft.com/office/word/2010/wordprocessingInk" xmlns:wne="http://schemas.microsoft.com/office/word/2006/wordml" xmlns:wps="http://schemas.microsoft.com/office/word/2010/wordprocessingShape" mc:Ignorable="w14 w15 w16se wp14">
+<w:document xmlns:ns1="http://schemas.openxmlformats.org/markup-compatibility/2006" xmlns:ns10="http://schemas.openxmlformats.org/officeDocument/2006/relationships" xmlns:ns2="http://schemas.openxmlformats.org/drawingml/2006/wordprocessingDrawing" xmlns:ns3="http://schemas.microsoft.com/office/word/2010/wordprocessingDrawing" xmlns:ns4="http://schemas.openxmlformats.org/drawingml/2006/main" xmlns:ns5="http://schemas.microsoft.com/office/word/2010/wordprocessingShape" xmlns:ns6="urn:schemas-microsoft-com:vml" xmlns:ns7="http://schemas.microsoft.com/office/word/2010/wordml" xmlns:ns8="urn:schemas-microsoft-com:office:office" xmlns:ns9="urn:schemas-microsoft-com:office:word" xmlns:w="http://schemas.openxmlformats.org/wordprocessingml/2006/main" ns1:Ignorable="w14 w15 w16se wp14">
   <w:body>
     <w:sdt>
       <w:sdtPr>
@@ -35,73 +35,73 @@
                 </w:rPr>
               </w:rPrChange>
             </w:rPr>
-            <mc:AlternateContent>
-              <mc:Choice Requires="wps">
+            <ns1:AlternateContent>
+              <ns1:Choice Requires="wps">
                 <w:drawing>
-                  <wp:anchor distT="0" distB="0" distL="114300" distR="114300" simplePos="0" relativeHeight="251661312" behindDoc="0" locked="0" layoutInCell="1" allowOverlap="1" wp14:anchorId="371CE751" wp14:editId="6AE2D921">
-                    <wp:simplePos x="0" y="0"/>
-                    <mc:AlternateContent>
-                      <mc:Choice Requires="wp14">
-                        <wp:positionH relativeFrom="page">
-                          <wp14:pctPosHOffset>42000</wp14:pctPosHOffset>
-                        </wp:positionH>
-                      </mc:Choice>
-                      <mc:Fallback>
-                        <wp:positionH relativeFrom="page">
-                          <wp:posOffset>3263900</wp:posOffset>
-                        </wp:positionH>
-                      </mc:Fallback>
-                    </mc:AlternateContent>
-                    <mc:AlternateContent>
-                      <mc:Choice Requires="wp14">
-                        <wp:positionV relativeFrom="page">
-                          <wp14:pctPosVOffset>88000</wp14:pctPosVOffset>
-                        </wp:positionV>
-                      </mc:Choice>
-                      <mc:Fallback>
-                        <wp:positionV relativeFrom="page">
-                          <wp:posOffset>8851265</wp:posOffset>
-                        </wp:positionV>
-                      </mc:Fallback>
-                    </mc:AlternateContent>
-                    <wp:extent cx="3657600" cy="365760"/>
-                    <wp:effectExtent l="0" t="0" r="0" b="0"/>
-                    <wp:wrapNone/>
-                    <wp:docPr id="32" name="Cuadro de texto 32"/>
-                    <wp:cNvGraphicFramePr/>
-                    <a:graphic xmlns:a="http://schemas.openxmlformats.org/drawingml/2006/main">
-                      <a:graphicData uri="http://schemas.microsoft.com/office/word/2010/wordprocessingShape">
-                        <wps:wsp>
-                          <wps:cNvSpPr txBox="1"/>
-                          <wps:spPr>
-                            <a:xfrm>
-                              <a:off x="0" y="0"/>
-                              <a:ext cx="3657600" cy="365760"/>
-                            </a:xfrm>
-                            <a:prstGeom prst="rect">
-                              <a:avLst/>
-                            </a:prstGeom>
-                            <a:noFill/>
-                            <a:ln w="6350">
-                              <a:noFill/>
-                            </a:ln>
-                            <a:effectLst/>
-                          </wps:spPr>
-                          <wps:style>
-                            <a:lnRef idx="0">
-                              <a:schemeClr val="accent1"/>
-                            </a:lnRef>
-                            <a:fillRef idx="0">
-                              <a:schemeClr val="accent1"/>
-                            </a:fillRef>
-                            <a:effectRef idx="0">
-                              <a:schemeClr val="accent1"/>
-                            </a:effectRef>
-                            <a:fontRef idx="minor">
-                              <a:schemeClr val="dk1"/>
-                            </a:fontRef>
-                          </wps:style>
-                          <wps:txbx>
+                  <ns2:anchor distT="0" distB="0" distL="114300" distR="114300" simplePos="0" relativeHeight="251661312" behindDoc="0" locked="0" layoutInCell="1" allowOverlap="1" ns3:anchorId="371CE751" ns3:editId="6AE2D921">
+                    <ns2:simplePos x="0" y="0"/>
+                    <ns1:AlternateContent>
+                      <ns1:Choice Requires="wp14">
+                        <ns2:positionH relativeFrom="page">
+                          <ns3:pctPosHOffset>42000</ns3:pctPosHOffset>
+                        </ns2:positionH>
+                      </ns1:Choice>
+                      <ns1:Fallback>
+                        <ns2:positionH relativeFrom="page">
+                          <ns2:posOffset>3263900</ns2:posOffset>
+                        </ns2:positionH>
+                      </ns1:Fallback>
+                    </ns1:AlternateContent>
+                    <ns1:AlternateContent>
+                      <ns1:Choice Requires="wp14">
+                        <ns2:positionV relativeFrom="page">
+                          <ns3:pctPosVOffset>88000</ns3:pctPosVOffset>
+                        </ns2:positionV>
+                      </ns1:Choice>
+                      <ns1:Fallback>
+                        <ns2:positionV relativeFrom="page">
+                          <ns2:posOffset>8851265</ns2:posOffset>
+                        </ns2:positionV>
+                      </ns1:Fallback>
+                    </ns1:AlternateContent>
+                    <ns2:extent cx="3657600" cy="365760"/>
+                    <ns2:effectExtent l="0" t="0" r="0" b="0"/>
+                    <ns2:wrapNone/>
+                    <ns2:docPr id="32" name="Cuadro de texto 32"/>
+                    <ns2:cNvGraphicFramePr/>
+                    <ns4:graphic>
+                      <ns4:graphicData uri="http://schemas.microsoft.com/office/word/2010/wordprocessingShape">
+                        <ns5:wsp>
+                          <ns5:cNvSpPr txBox="1"/>
+                          <ns5:spPr>
+                            <ns4:xfrm>
+                              <ns4:off x="0" y="0"/>
+                              <ns4:ext cx="3657600" cy="365760"/>
+                            </ns4:xfrm>
+                            <ns4:prstGeom prst="rect">
+                              <ns4:avLst/>
+                            </ns4:prstGeom>
+                            <ns4:noFill/>
+                            <ns4:ln w="6350">
+                              <ns4:noFill/>
+                            </ns4:ln>
+                            <ns4:effectLst/>
+                          </ns5:spPr>
+                          <ns5:style>
+                            <ns4:lnRef idx="0">
+                              <ns4:schemeClr val="accent1"/>
+                            </ns4:lnRef>
+                            <ns4:fillRef idx="0">
+                              <ns4:schemeClr val="accent1"/>
+                            </ns4:fillRef>
+                            <ns4:effectRef idx="0">
+                              <ns4:schemeClr val="accent1"/>
+                            </ns4:effectRef>
+                            <ns4:fontRef idx="minor">
+                              <ns4:schemeClr val="dk1"/>
+                            </ns4:fontRef>
+                          </ns5:style>
+                          <ns5:txbx>
                             <w:txbxContent>
                               <w:p>
                                 <w:pPr>
@@ -209,33 +209,33 @@
                                 </w:sdt>
                               </w:p>
                             </w:txbxContent>
-                          </wps:txbx>
-                          <wps:bodyPr rot="0" spcFirstLastPara="0" vertOverflow="overflow" horzOverflow="overflow" vert="horz" wrap="square" lIns="0" tIns="0" rIns="0" bIns="0" numCol="1" spcCol="0" rtlCol="0" fromWordArt="0" anchor="b" anchorCtr="0" forceAA="0" compatLnSpc="1">
-                            <a:prstTxWarp prst="textNoShape">
-                              <a:avLst/>
-                            </a:prstTxWarp>
-                            <a:spAutoFit/>
-                          </wps:bodyPr>
-                        </wps:wsp>
-                      </a:graphicData>
-                    </a:graphic>
-                    <wp14:sizeRelH relativeFrom="page">
-                      <wp14:pctWidth>45000</wp14:pctWidth>
-                    </wp14:sizeRelH>
-                    <wp14:sizeRelV relativeFrom="margin">
-                      <wp14:pctHeight>0</wp14:pctHeight>
-                    </wp14:sizeRelV>
-                  </wp:anchor>
+                          </ns5:txbx>
+                          <ns5:bodyPr rot="0" spcFirstLastPara="0" vertOverflow="overflow" horzOverflow="overflow" vert="horz" wrap="square" lIns="0" tIns="0" rIns="0" bIns="0" numCol="1" spcCol="0" rtlCol="0" fromWordArt="0" anchor="b" anchorCtr="0" forceAA="0" compatLnSpc="1">
+                            <ns4:prstTxWarp prst="textNoShape">
+                              <ns4:avLst/>
+                            </ns4:prstTxWarp>
+                            <ns4:spAutoFit/>
+                          </ns5:bodyPr>
+                        </ns5:wsp>
+                      </ns4:graphicData>
+                    </ns4:graphic>
+                    <ns3:sizeRelH relativeFrom="page">
+                      <ns3:pctWidth>45000</ns3:pctWidth>
+                    </ns3:sizeRelH>
+                    <ns3:sizeRelV relativeFrom="margin">
+                      <ns3:pctHeight>0</ns3:pctHeight>
+                    </ns3:sizeRelV>
+                  </ns2:anchor>
                 </w:drawing>
-              </mc:Choice>
-              <mc:Fallback>
+              </ns1:Choice>
+              <ns1:Fallback>
                 <w:pict>
-                  <v:shapetype w14:anchorId="371CE751" id="_x0000_t202" coordsize="21600,21600" o:spt="202" path="m,l,21600r21600,l21600,xe">
-                    <v:stroke joinstyle="miter"/>
-                    <v:path gradientshapeok="t" o:connecttype="rect"/>
-                  </v:shapetype>
-                  <v:shape id="Cuadro de texto 32" o:spid="_x0000_s1026" type="#_x0000_t202" style="position:absolute;margin-left:0;margin-top:0;width:4in;height:28.8pt;z-index:251661312;visibility:visible;mso-wrap-style:square;mso-width-percent:450;mso-height-percent:0;mso-left-percent:420;mso-top-percent:880;mso-wrap-distance-left:9pt;mso-wrap-distance-top:0;mso-wrap-distance-right:9pt;mso-wrap-distance-bottom:0;mso-position-horizontal-relative:page;mso-position-vertical-relative:page;mso-width-percent:450;mso-height-percent:0;mso-left-percent:420;mso-top-percent:880;mso-width-relative:page;mso-height-relative:margin;v-text-anchor:bottom" o:gfxdata="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" filled="f" stroked="f" strokeweight=".5pt">
-                    <v:textbox style="mso-fit-shape-to-text:t" inset="0,0,0,0">
+                  <ns6:shapetype ns7:anchorId="371CE751" id="_x0000_t202" coordsize="21600,21600" ns8:spt="202" path="m,l,21600r21600,l21600,xe">
+                    <ns6:stroke joinstyle="miter"/>
+                    <ns6:path gradientshapeok="t" ns8:connecttype="rect"/>
+                  </ns6:shapetype>
+                  <ns6:shape id="Cuadro de texto 32" ns8:spid="_x0000_s1026" type="#_x0000_t202" style="position:absolute;margin-left:0;margin-top:0;width:4in;height:28.8pt;z-index:251661312;visibility:visible;mso-wrap-style:square;mso-width-percent:450;mso-height-percent:0;mso-left-percent:420;mso-top-percent:880;mso-wrap-distance-left:9pt;mso-wrap-distance-top:0;mso-wrap-distance-right:9pt;mso-wrap-distance-bottom:0;mso-position-horizontal-relative:page;mso-position-vertical-relative:page;mso-width-percent:450;mso-height-percent:0;mso-left-percent:420;mso-top-percent:880;mso-width-relative:page;mso-height-relative:margin;v-text-anchor:bottom" ns8:gfxdata="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" filled="f" stroked="f" strokeweight=".5pt">
+                    <ns6:textbox style="mso-fit-shape-to-text:t" inset="0,0,0,0">
                       <w:txbxContent>
                         <w:p>
                           <w:pPr>
@@ -343,12 +343,12 @@
                           </w:sdt>
                         </w:p>
                       </w:txbxContent>
-                    </v:textbox>
-                    <w10:wrap anchorx="page" anchory="page"/>
-                  </v:shape>
+                    </ns6:textbox>
+                    <ns9:wrap anchorx="page" anchory="page"/>
+                  </ns6:shape>
                 </w:pict>
-              </mc:Fallback>
-            </mc:AlternateContent>
+              </ns1:Fallback>
+            </ns1:AlternateContent>
           </w:r>
           <w:r>
             <w:rPr>
@@ -360,73 +360,73 @@
                 </w:rPr>
               </w:rPrChange>
             </w:rPr>
-            <mc:AlternateContent>
-              <mc:Choice Requires="wps">
+            <ns1:AlternateContent>
+              <ns1:Choice Requires="wps">
                 <w:drawing>
-                  <wp:anchor distT="0" distB="0" distL="114300" distR="114300" simplePos="0" relativeHeight="251660288" behindDoc="0" locked="0" layoutInCell="1" allowOverlap="1" wp14:anchorId="1BB0A480" wp14:editId="62A39059">
-                    <wp:simplePos x="0" y="0"/>
-                    <mc:AlternateContent>
-                      <mc:Choice Requires="wp14">
-                        <wp:positionH relativeFrom="page">
-                          <wp14:pctPosHOffset>42000</wp14:pctPosHOffset>
-                        </wp:positionH>
-                      </mc:Choice>
-                      <mc:Fallback>
-                        <wp:positionH relativeFrom="page">
-                          <wp:posOffset>3263900</wp:posOffset>
-                        </wp:positionH>
-                      </mc:Fallback>
-                    </mc:AlternateContent>
-                    <mc:AlternateContent>
-                      <mc:Choice Requires="wp14">
-                        <wp:positionV relativeFrom="page">
-                          <wp14:pctPosVOffset>17500</wp14:pctPosVOffset>
-                        </wp:positionV>
-                      </mc:Choice>
-                      <mc:Fallback>
-                        <wp:positionV relativeFrom="page">
-                          <wp:posOffset>1760220</wp:posOffset>
-                        </wp:positionV>
-                      </mc:Fallback>
-                    </mc:AlternateContent>
-                    <wp:extent cx="3657600" cy="1069848"/>
-                    <wp:effectExtent l="0" t="0" r="7620" b="635"/>
-                    <wp:wrapNone/>
-                    <wp:docPr id="1" name="Cuadro de texto 1"/>
-                    <wp:cNvGraphicFramePr/>
-                    <a:graphic xmlns:a="http://schemas.openxmlformats.org/drawingml/2006/main">
-                      <a:graphicData uri="http://schemas.microsoft.com/office/word/2010/wordprocessingShape">
-                        <wps:wsp>
-                          <wps:cNvSpPr txBox="1"/>
-                          <wps:spPr>
-                            <a:xfrm>
-                              <a:off x="0" y="0"/>
-                              <a:ext cx="3657600" cy="1069848"/>
-                            </a:xfrm>
-                            <a:prstGeom prst="rect">
-                              <a:avLst/>
-                            </a:prstGeom>
-                            <a:noFill/>
-                            <a:ln w="6350">
-                              <a:noFill/>
-                            </a:ln>
-                            <a:effectLst/>
-                          </wps:spPr>
-                          <wps:style>
-                            <a:lnRef idx="0">
-                              <a:schemeClr val="accent1"/>
-                            </a:lnRef>
-                            <a:fillRef idx="0">
-                              <a:schemeClr val="accent1"/>
-                            </a:fillRef>
-                            <a:effectRef idx="0">
-                              <a:schemeClr val="accent1"/>
-                            </a:effectRef>
-                            <a:fontRef idx="minor">
-                              <a:schemeClr val="dk1"/>
-                            </a:fontRef>
-                          </wps:style>
-                          <wps:txbx>
+                  <ns2:anchor distT="0" distB="0" distL="114300" distR="114300" simplePos="0" relativeHeight="251660288" behindDoc="0" locked="0" layoutInCell="1" allowOverlap="1" ns3:anchorId="1BB0A480" ns3:editId="62A39059">
+                    <ns2:simplePos x="0" y="0"/>
+                    <ns1:AlternateContent>
+                      <ns1:Choice Requires="wp14">
+                        <ns2:positionH relativeFrom="page">
+                          <ns3:pctPosHOffset>42000</ns3:pctPosHOffset>
+                        </ns2:positionH>
+                      </ns1:Choice>
+                      <ns1:Fallback>
+                        <ns2:positionH relativeFrom="page">
+                          <ns2:posOffset>3263900</ns2:posOffset>
+                        </ns2:positionH>
+                      </ns1:Fallback>
+                    </ns1:AlternateContent>
+                    <ns1:AlternateContent>
+                      <ns1:Choice Requires="wp14">
+                        <ns2:positionV relativeFrom="page">
+                          <ns3:pctPosVOffset>17500</ns3:pctPosVOffset>
+                        </ns2:positionV>
+                      </ns1:Choice>
+                      <ns1:Fallback>
+                        <ns2:positionV relativeFrom="page">
+                          <ns2:posOffset>1760220</ns2:posOffset>
+                        </ns2:positionV>
+                      </ns1:Fallback>
+                    </ns1:AlternateContent>
+                    <ns2:extent cx="3657600" cy="1069848"/>
+                    <ns2:effectExtent l="0" t="0" r="7620" b="635"/>
+                    <ns2:wrapNone/>
+                    <ns2:docPr id="1" name="Cuadro de texto 1"/>
+                    <ns2:cNvGraphicFramePr/>
+                    <ns4:graphic>
+                      <ns4:graphicData uri="http://schemas.microsoft.com/office/word/2010/wordprocessingShape">
+                        <ns5:wsp>
+                          <ns5:cNvSpPr txBox="1"/>
+                          <ns5:spPr>
+                            <ns4:xfrm>
+                              <ns4:off x="0" y="0"/>
+                              <ns4:ext cx="3657600" cy="1069848"/>
+                            </ns4:xfrm>
+                            <ns4:prstGeom prst="rect">
+                              <ns4:avLst/>
+                            </ns4:prstGeom>
+                            <ns4:noFill/>
+                            <ns4:ln w="6350">
+                              <ns4:noFill/>
+                            </ns4:ln>
+                            <ns4:effectLst/>
+                          </ns5:spPr>
+                          <ns5:style>
+                            <ns4:lnRef idx="0">
+                              <ns4:schemeClr val="accent1"/>
+                            </ns4:lnRef>
+                            <ns4:fillRef idx="0">
+                              <ns4:schemeClr val="accent1"/>
+                            </ns4:fillRef>
+                            <ns4:effectRef idx="0">
+                              <ns4:schemeClr val="accent1"/>
+                            </ns4:effectRef>
+                            <ns4:fontRef idx="minor">
+                              <ns4:schemeClr val="dk1"/>
+                            </ns4:fontRef>
+                          </ns5:style>
+                          <ns5:txbx>
                             <w:txbxContent>
                               <w:p>
                                 <w:pPr>
@@ -565,29 +565,29 @@
                                 </w:sdt>
                               </w:p>
                             </w:txbxContent>
-                          </wps:txbx>
-                          <wps:bodyPr rot="0" spcFirstLastPara="0" vertOverflow="overflow" horzOverflow="overflow" vert="horz" wrap="square" lIns="0" tIns="0" rIns="0" bIns="0" numCol="1" spcCol="0" rtlCol="0" fromWordArt="0" anchor="t" anchorCtr="0" forceAA="0" compatLnSpc="1">
-                            <a:prstTxWarp prst="textNoShape">
-                              <a:avLst/>
-                            </a:prstTxWarp>
-                            <a:spAutoFit/>
-                          </wps:bodyPr>
-                        </wps:wsp>
-                      </a:graphicData>
-                    </a:graphic>
-                    <wp14:sizeRelH relativeFrom="page">
-                      <wp14:pctWidth>45000</wp14:pctWidth>
-                    </wp14:sizeRelH>
-                    <wp14:sizeRelV relativeFrom="margin">
-                      <wp14:pctHeight>0</wp14:pctHeight>
-                    </wp14:sizeRelV>
-                  </wp:anchor>
+                          </ns5:txbx>
+                          <ns5:bodyPr rot="0" spcFirstLastPara="0" vertOverflow="overflow" horzOverflow="overflow" vert="horz" wrap="square" lIns="0" tIns="0" rIns="0" bIns="0" numCol="1" spcCol="0" rtlCol="0" fromWordArt="0" anchor="t" anchorCtr="0" forceAA="0" compatLnSpc="1">
+                            <ns4:prstTxWarp prst="textNoShape">
+                              <ns4:avLst/>
+                            </ns4:prstTxWarp>
+                            <ns4:spAutoFit/>
+                          </ns5:bodyPr>
+                        </ns5:wsp>
+                      </ns4:graphicData>
+                    </ns4:graphic>
+                    <ns3:sizeRelH relativeFrom="page">
+                      <ns3:pctWidth>45000</ns3:pctWidth>
+                    </ns3:sizeRelH>
+                    <ns3:sizeRelV relativeFrom="margin">
+                      <ns3:pctHeight>0</ns3:pctHeight>
+                    </ns3:sizeRelV>
+                  </ns2:anchor>
                 </w:drawing>
-              </mc:Choice>
-              <mc:Fallback>
+              </ns1:Choice>
+              <ns1:Fallback>
                 <w:pict>
-                  <v:shape w14:anchorId="1BB0A480" id="Cuadro de texto 1" o:spid="_x0000_s1027" type="#_x0000_t202" style="position:absolute;margin-left:0;margin-top:0;width:4in;height:84.25pt;z-index:251660288;visibility:visible;mso-wrap-style:square;mso-width-percent:450;mso-height-percent:0;mso-left-percent:420;mso-top-percent:175;mso-wrap-distance-left:9pt;mso-wrap-distance-top:0;mso-wrap-distance-right:9pt;mso-wrap-distance-bottom:0;mso-position-horizontal-relative:page;mso-position-vertical-relative:page;mso-width-percent:450;mso-height-percent:0;mso-left-percent:420;mso-top-percent:175;mso-width-relative:page;mso-height-relative:margin;v-text-anchor:top" o:gfxdata="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" filled="f" stroked="f" strokeweight=".5pt">
-                    <v:textbox style="mso-fit-shape-to-text:t" inset="0,0,0,0">
+                  <ns6:shape ns7:anchorId="1BB0A480" id="Cuadro de texto 1" ns8:spid="_x0000_s1027" type="#_x0000_t202" style="position:absolute;margin-left:0;margin-top:0;width:4in;height:84.25pt;z-index:251660288;visibility:visible;mso-wrap-style:square;mso-width-percent:450;mso-height-percent:0;mso-left-percent:420;mso-top-percent:175;mso-wrap-distance-left:9pt;mso-wrap-distance-top:0;mso-wrap-distance-right:9pt;mso-wrap-distance-bottom:0;mso-position-horizontal-relative:page;mso-position-vertical-relative:page;mso-width-percent:450;mso-height-percent:0;mso-left-percent:420;mso-top-percent:175;mso-width-relative:page;mso-height-relative:margin;v-text-anchor:top" ns8:gfxdata="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" filled="f" stroked="f" strokeweight=".5pt">
+                    <ns6:textbox style="mso-fit-shape-to-text:t" inset="0,0,0,0">
                       <w:txbxContent>
                         <w:p>
                           <w:pPr>
@@ -726,12 +726,12 @@
                           </w:sdt>
                         </w:p>
                       </w:txbxContent>
-                    </v:textbox>
-                    <w10:wrap anchorx="page" anchory="page"/>
-                  </v:shape>
+                    </ns6:textbox>
+                    <ns9:wrap anchorx="page" anchory="page"/>
+                  </ns6:shape>
                 </w:pict>
-              </mc:Fallback>
-            </mc:AlternateContent>
+              </ns1:Fallback>
+            </ns1:AlternateContent>
           </w:r>
         </w:p>
         <w:p>
@@ -747,60 +747,60 @@
               <w:noProof/>
               <w:lang w:eastAsia="es-CO"/>
             </w:rPr>
-            <mc:AlternateContent>
-              <mc:Choice Requires="wps">
+            <ns1:AlternateContent>
+              <ns1:Choice Requires="wps">
                 <w:drawing>
-                  <wp:anchor distT="0" distB="0" distL="114300" distR="114300" simplePos="0" relativeHeight="251658240" behindDoc="1" locked="0" layoutInCell="1" allowOverlap="1" wp14:anchorId="37E59BF8" wp14:editId="7E9D59AC">
-                    <wp:simplePos x="0" y="0"/>
-                    <wp:positionH relativeFrom="column">
-                      <wp:posOffset>-1072193</wp:posOffset>
-                    </wp:positionH>
-                    <wp:positionV relativeFrom="paragraph">
-                      <wp:posOffset>927735</wp:posOffset>
-                    </wp:positionV>
-                    <wp:extent cx="2503968" cy="552055"/>
-                    <wp:effectExtent l="0" t="0" r="29845" b="19685"/>
-                    <wp:wrapNone/>
-                    <wp:docPr id="4" name="Pentágono 4"/>
-                    <wp:cNvGraphicFramePr/>
-                    <a:graphic xmlns:a="http://schemas.openxmlformats.org/drawingml/2006/main">
-                      <a:graphicData uri="http://schemas.microsoft.com/office/word/2010/wordprocessingShape">
-                        <wps:wsp>
-                          <wps:cNvSpPr/>
-                          <wps:spPr>
-                            <a:xfrm>
-                              <a:off x="0" y="0"/>
-                              <a:ext cx="2503968" cy="552055"/>
-                            </a:xfrm>
-                            <a:prstGeom prst="homePlate">
-                              <a:avLst/>
-                            </a:prstGeom>
-                            <a:solidFill>
-                              <a:srgbClr val="0B5C23"/>
-                            </a:solidFill>
-                            <a:ln>
-                              <a:solidFill>
-                                <a:srgbClr val="0D8932"/>
-                              </a:solidFill>
-                            </a:ln>
-                          </wps:spPr>
-                          <wps:style>
-                            <a:lnRef idx="2">
-                              <a:schemeClr val="accent1">
-                                <a:shade val="50000"/>
-                              </a:schemeClr>
-                            </a:lnRef>
-                            <a:fillRef idx="1">
-                              <a:schemeClr val="accent1"/>
-                            </a:fillRef>
-                            <a:effectRef idx="0">
-                              <a:schemeClr val="accent1"/>
-                            </a:effectRef>
-                            <a:fontRef idx="minor">
-                              <a:schemeClr val="lt1"/>
-                            </a:fontRef>
-                          </wps:style>
-                          <wps:txbx>
+                  <ns2:anchor distT="0" distB="0" distL="114300" distR="114300" simplePos="0" relativeHeight="251658240" behindDoc="1" locked="0" layoutInCell="1" allowOverlap="1" ns3:anchorId="37E59BF8" ns3:editId="7E9D59AC">
+                    <ns2:simplePos x="0" y="0"/>
+                    <ns2:positionH relativeFrom="column">
+                      <ns2:posOffset>-1072193</ns2:posOffset>
+                    </ns2:positionH>
+                    <ns2:positionV relativeFrom="paragraph">
+                      <ns2:posOffset>927735</ns2:posOffset>
+                    </ns2:positionV>
+                    <ns2:extent cx="2503968" cy="552055"/>
+                    <ns2:effectExtent l="0" t="0" r="29845" b="19685"/>
+                    <ns2:wrapNone/>
+                    <ns2:docPr id="4" name="Pentágono 4"/>
+                    <ns2:cNvGraphicFramePr/>
+                    <ns4:graphic>
+                      <ns4:graphicData uri="http://schemas.microsoft.com/office/word/2010/wordprocessingShape">
+                        <ns5:wsp>
+                          <ns5:cNvSpPr/>
+                          <ns5:spPr>
+                            <ns4:xfrm>
+                              <ns4:off x="0" y="0"/>
+                              <ns4:ext cx="2503968" cy="552055"/>
+                            </ns4:xfrm>
+                            <ns4:prstGeom prst="homePlate">
+                              <ns4:avLst/>
+                            </ns4:prstGeom>
+                            <ns4:solidFill>
+                              <ns4:srgbClr val="0B5C23"/>
+                            </ns4:solidFill>
+                            <ns4:ln>
+                              <ns4:solidFill>
+                                <ns4:srgbClr val="0D8932"/>
+                              </ns4:solidFill>
+                            </ns4:ln>
+                          </ns5:spPr>
+                          <ns5:style>
+                            <ns4:lnRef idx="2">
+                              <ns4:schemeClr val="accent1">
+                                <ns4:shade val="50000"/>
+                              </ns4:schemeClr>
+                            </ns4:lnRef>
+                            <ns4:fillRef idx="1">
+                              <ns4:schemeClr val="accent1"/>
+                            </ns4:fillRef>
+                            <ns4:effectRef idx="0">
+                              <ns4:schemeClr val="accent1"/>
+                            </ns4:effectRef>
+                            <ns4:fontRef idx="minor">
+                              <ns4:schemeClr val="lt1"/>
+                            </ns4:fontRef>
+                          </ns5:style>
+                          <ns5:txbx>
                             <w:txbxContent>
                               <w:sdt>
                                 <w:sdtPr>
@@ -863,37 +863,37 @@
                                 </w:sdtContent>
                               </w:sdt>
                             </w:txbxContent>
-                          </wps:txbx>
-                          <wps:bodyPr rot="0" spcFirstLastPara="0" vert="horz" wrap="square" lIns="91440" tIns="0" rIns="182880" bIns="0" numCol="1" spcCol="0" rtlCol="0" fromWordArt="0" anchor="ctr" anchorCtr="0" forceAA="0" compatLnSpc="1">
-                            <a:prstTxWarp prst="textNoShape">
-                              <a:avLst/>
-                            </a:prstTxWarp>
-                            <a:noAutofit/>
-                          </wps:bodyPr>
-                        </wps:wsp>
-                      </a:graphicData>
-                    </a:graphic>
-                    <wp14:sizeRelH relativeFrom="margin">
-                      <wp14:pctWidth>0</wp14:pctWidth>
-                    </wp14:sizeRelH>
-                  </wp:anchor>
+                          </ns5:txbx>
+                          <ns5:bodyPr rot="0" spcFirstLastPara="0" vert="horz" wrap="square" lIns="91440" tIns="0" rIns="182880" bIns="0" numCol="1" spcCol="0" rtlCol="0" fromWordArt="0" anchor="ctr" anchorCtr="0" forceAA="0" compatLnSpc="1">
+                            <ns4:prstTxWarp prst="textNoShape">
+                              <ns4:avLst/>
+                            </ns4:prstTxWarp>
+                            <ns4:noAutofit/>
+                          </ns5:bodyPr>
+                        </ns5:wsp>
+                      </ns4:graphicData>
+                    </ns4:graphic>
+                    <ns3:sizeRelH relativeFrom="margin">
+                      <ns3:pctWidth>0</ns3:pctWidth>
+                    </ns3:sizeRelH>
+                  </ns2:anchor>
                 </w:drawing>
-              </mc:Choice>
-              <mc:Fallback>
+              </ns1:Choice>
+              <ns1:Fallback>
                 <w:pict>
-                  <v:shapetype w14:anchorId="37E59BF8" id="_x0000_t15" coordsize="21600,21600" o:spt="15" adj="16200" path="m@0,l,,,21600@0,21600,21600,10800xe">
-                    <v:stroke joinstyle="miter"/>
-                    <v:formulas>
-                      <v:f eqn="val #0"/>
-                      <v:f eqn="prod #0 1 2"/>
-                    </v:formulas>
-                    <v:path gradientshapeok="t" o:connecttype="custom" o:connectlocs="@1,0;0,10800;@1,21600;21600,10800" o:connectangles="270,180,90,0" textboxrect="0,0,10800,21600;0,0,16200,21600;0,0,21600,21600"/>
-                    <v:handles>
-                      <v:h position="#0,topLeft" xrange="0,21600"/>
-                    </v:handles>
-                  </v:shapetype>
-                  <v:shape id="Pentágono 4" o:spid="_x0000_s1028" type="#_x0000_t15" style="position:absolute;margin-left:-84.4pt;margin-top:73.05pt;width:197.15pt;height:43.45pt;z-index:-251658240;visibility:visible;mso-wrap-style:square;mso-width-percent:0;mso-wrap-distance-left:9pt;mso-wrap-distance-top:0;mso-wrap-distance-right:9pt;mso-wrap-distance-bottom:0;mso-position-horizontal:absolute;mso-position-horizontal-relative:text;mso-position-vertical:absolute;mso-position-vertical-relative:text;mso-width-percent:0;mso-width-relative:margin;v-text-anchor:middle" o:gfxdata="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" adj="19219" fillcolor="#0b5c23" strokecolor="#0d8932" strokeweight="1pt">
-                    <v:textbox inset=",0,14.4pt,0">
+                  <ns6:shapetype ns7:anchorId="37E59BF8" id="_x0000_t15" coordsize="21600,21600" ns8:spt="15" adj="16200" path="m@0,l,,,21600@0,21600,21600,10800xe">
+                    <ns6:stroke joinstyle="miter"/>
+                    <ns6:formulas>
+                      <ns6:f eqn="val #0"/>
+                      <ns6:f eqn="prod #0 1 2"/>
+                    </ns6:formulas>
+                    <ns6:path gradientshapeok="t" ns8:connecttype="custom" ns8:connectlocs="@1,0;0,10800;@1,21600;21600,10800" ns8:connectangles="270,180,90,0" textboxrect="0,0,10800,21600;0,0,16200,21600;0,0,21600,21600"/>
+                    <ns6:handles>
+                      <ns6:h position="#0,topLeft" xrange="0,21600"/>
+                    </ns6:handles>
+                  </ns6:shapetype>
+                  <ns6:shape id="Pentágono 4" ns8:spid="_x0000_s1028" type="#_x0000_t15" style="position:absolute;margin-left:-84.4pt;margin-top:73.05pt;width:197.15pt;height:43.45pt;z-index:-251658240;visibility:visible;mso-wrap-style:square;mso-width-percent:0;mso-wrap-distance-left:9pt;mso-wrap-distance-top:0;mso-wrap-distance-right:9pt;mso-wrap-distance-bottom:0;mso-position-horizontal:absolute;mso-position-horizontal-relative:text;mso-position-vertical:absolute;mso-position-vertical-relative:text;mso-width-percent:0;mso-width-relative:margin;v-text-anchor:middle" ns8:gfxdata="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" adj="19219" fillcolor="#0b5c23" strokecolor="#0d8932" strokeweight="1pt">
+                    <ns6:textbox inset=",0,14.4pt,0">
                       <w:txbxContent>
                         <w:sdt>
                           <w:sdtPr>
@@ -956,11 +956,11 @@
                           </w:sdtContent>
                         </w:sdt>
                       </w:txbxContent>
-                    </v:textbox>
-                  </v:shape>
+                    </ns6:textbox>
+                  </ns6:shape>
                 </w:pict>
-              </mc:Fallback>
-            </mc:AlternateContent>
+              </ns1:Fallback>
+            </ns1:AlternateContent>
           </w:r>
           <w:r>
             <w:br w:type="page"/>
@@ -3361,11 +3361,11 @@
           <w:ins w:id="138" w:author="Juddy Tatiana Vargas Santofimio" w:date="2026-09-01T16:09:00Z"/>
         </w:rPr>
         <w:sectPr>
-          <w:headerReference w:type="even" r:id="rId9"/>
-          <w:headerReference w:type="default" r:id="rId10"/>
-          <w:footerReference w:type="even" r:id="rId11"/>
-          <w:footerReference w:type="default" r:id="rId12"/>
-          <w:headerReference w:type="first" r:id="rId13"/>
+          <w:headerReference w:type="even" ns10:id="rId9"/>
+          <w:headerReference w:type="default" ns10:id="rId10"/>
+          <w:footerReference w:type="even" ns10:id="rId11"/>
+          <w:footerReference w:type="default" ns10:id="rId12"/>
+          <w:headerReference w:type="first" ns10:id="rId13"/>
           <w:pgSz w:w="12240" w:h="15840"/>
           <w:pgMar w:top="1417" w:right="1701" w:bottom="1417" w:left="1701" w:header="708" w:footer="708" w:gutter="0"/>
           <w:pgNumType w:start="0"/>
@@ -6529,107 +6529,7 @@
               </w:pPrChange>
             </w:pPr>
             <w:r>
-              <w:t>El sistema debe listar los torneos del administrador separados en Activos y Finalizados, mostrando progreso por jornada (ej. J7/9) y el próximo partido programado</w:t>
-            </w:r>
-          </w:p>
-        </w:tc>
-      </w:tr>
-      <w:tr>
-        <w:trPr>
-          <w:cnfStyle w:val="000000010000" w:firstRow="0" w:lastRow="0" w:firstColumn="0" w:lastColumn="0" w:oddVBand="0" w:evenVBand="0" w:oddHBand="0" w:evenHBand="1" w:firstRowFirstColumn="0" w:firstRowLastColumn="0" w:lastRowFirstColumn="0" w:lastRowLastColumn="0"/>
-        </w:trPr>
-        <w:tc>
-          <w:tcPr>
-            <w:cnfStyle w:val="001000000000" w:firstRow="0" w:lastRow="0" w:firstColumn="1" w:lastColumn="0" w:oddVBand="0" w:evenVBand="0" w:oddHBand="0" w:evenHBand="0" w:firstRowFirstColumn="0" w:firstRowLastColumn="0" w:lastRowFirstColumn="0" w:lastRowLastColumn="0"/>
-            <w:tcW w:w="1472" w:type="dxa"/>
-            <w:vMerge/>
-            <w:tcPrChange w:id="523" w:author="Juddy Tatiana Vargas Santofimio" w:date="2026-09-13T14:58:00Z">
-              <w:tcPr>
-                <w:tcW w:w="1472" w:type="dxa"/>
-                <w:vMerge/>
-              </w:tcPr>
-            </w:tcPrChange>
-          </w:tcPr>
-          <w:p>
-            <w:pPr>
-              <w:spacing w:after="160" w:line="259" w:lineRule="auto"/>
-              <w:cnfStyle w:val="001000010000" w:firstRow="0" w:lastRow="0" w:firstColumn="1" w:lastColumn="0" w:oddVBand="0" w:evenVBand="0" w:oddHBand="0" w:evenHBand="1" w:firstRowFirstColumn="0" w:firstRowLastColumn="0" w:lastRowFirstColumn="0" w:lastRowLastColumn="0"/>
-              <w:rPr>
-                <w:b w:val="0"/>
-                <w:color w:val="auto"/>
-                <w:rPrChange w:id="524" w:author="Juddy Tatiana Vargas Santofimio" w:date="2026-09-01T15:16:00Z">
-                  <w:rPr>
-                    <w:bCs/>
-                    <w:color w:val="0D8932"/>
-                  </w:rPr>
-                </w:rPrChange>
-              </w:rPr>
-              <w:pPrChange w:id="525" w:author="Juddy Tatiana Vargas Santofimio" w:date="2026-09-01T15:19:00Z">
-                <w:pPr>
-                  <w:cnfStyle w:val="001000010000" w:firstRow="0" w:lastRow="0" w:firstColumn="1" w:lastColumn="0" w:oddVBand="0" w:evenVBand="0" w:oddHBand="0" w:evenHBand="1" w:firstRowFirstColumn="0" w:firstRowLastColumn="0" w:lastRowFirstColumn="0" w:lastRowLastColumn="0"/>
-                </w:pPr>
-              </w:pPrChange>
-            </w:pPr>
-          </w:p>
-        </w:tc>
-        <w:tc>
-          <w:tcPr>
-            <w:tcW w:w="1679" w:type="dxa"/>
-            <w:tcPrChange w:id="526" w:author="Juddy Tatiana Vargas Santofimio" w:date="2026-09-13T14:58:00Z">
-              <w:tcPr>
-                <w:tcW w:w="1679" w:type="dxa"/>
-                <w:tcMar>
-                  <w:top w:w="80" w:type="dxa"/>
-                  <w:left w:w="100" w:type="dxa"/>
-                  <w:bottom w:w="80" w:type="dxa"/>
-                  <w:right w:w="100" w:type="dxa"/>
-                </w:tcMar>
-              </w:tcPr>
-            </w:tcPrChange>
-          </w:tcPr>
-          <w:p>
-            <w:pPr>
-              <w:pStyle w:val="Prrafodelista"/>
-              <w:numPr>
-                <w:ilvl w:val="0"/>
-                <w:numId w:val="28"/>
-              </w:numPr>
-              <w:ind w:left="426"/>
-              <w:cnfStyle w:val="000000010000" w:firstRow="0" w:lastRow="0" w:firstColumn="0" w:lastColumn="0" w:oddVBand="0" w:evenVBand="0" w:oddHBand="0" w:evenHBand="1" w:firstRowFirstColumn="0" w:firstRowLastColumn="0" w:lastRowFirstColumn="0" w:lastRowLastColumn="0"/>
-              <w:pPrChange w:id="527" w:author="Juddy Tatiana Vargas Santofimio" w:date="2026-09-01T15:29:00Z">
-                <w:pPr>
-                  <w:cnfStyle w:val="000000010000" w:firstRow="0" w:lastRow="0" w:firstColumn="0" w:lastColumn="0" w:oddVBand="0" w:evenVBand="0" w:oddHBand="0" w:evenHBand="1" w:firstRowFirstColumn="0" w:firstRowLastColumn="0" w:lastRowFirstColumn="0" w:lastRowLastColumn="0"/>
-                </w:pPr>
-              </w:pPrChange>
-            </w:pPr>
-          </w:p>
-        </w:tc>
-        <w:tc>
-          <w:tcPr>
-            <w:tcW w:w="5669" w:type="dxa"/>
-            <w:tcPrChange w:id="528" w:author="Juddy Tatiana Vargas Santofimio" w:date="2026-09-13T14:58:00Z">
-              <w:tcPr>
-                <w:tcW w:w="5669" w:type="dxa"/>
-                <w:tcMar>
-                  <w:top w:w="80" w:type="dxa"/>
-                  <w:left w:w="100" w:type="dxa"/>
-                  <w:bottom w:w="80" w:type="dxa"/>
-                  <w:right w:w="100" w:type="dxa"/>
-                </w:tcMar>
-              </w:tcPr>
-            </w:tcPrChange>
-          </w:tcPr>
-          <w:p>
-            <w:pPr>
-              <w:cnfStyle w:val="000000010000" w:firstRow="0" w:lastRow="0" w:firstColumn="0" w:lastColumn="0" w:oddVBand="0" w:evenVBand="0" w:oddHBand="0" w:evenHBand="1" w:firstRowFirstColumn="0" w:firstRowLastColumn="0" w:lastRowFirstColumn="0" w:lastRowLastColumn="0"/>
-              <w:pPrChange w:id="529" w:author="Juddy Tatiana Vargas Santofimio" w:date="2026-09-13T15:17:00Z">
-                <w:pPr>
-                  <w:cnfStyle w:val="000000010000" w:firstRow="0" w:lastRow="0" w:firstColumn="0" w:lastColumn="0" w:oddVBand="0" w:evenVBand="0" w:oddHBand="0" w:evenHBand="1" w:firstRowFirstColumn="0" w:firstRowLastColumn="0" w:lastRowFirstColumn="0" w:lastRowLastColumn="0"/>
-                </w:pPr>
-              </w:pPrChange>
-            </w:pPr>
-            <w:r>
-              <w:t>El sistema debe permitir marcar torneos como favoritos para acceso rápido, con vista resumen de posiciones y jugadores destacados</w:t>
+              <w:t>El sistema debe listar todos los torneos disponibles agrupados por estado —En curso, Por iniciar y Finalizados—, mostrando progreso por jornada, filtros y el próximo partido programado</w:t>
             </w:r>
           </w:p>
         </w:tc>
@@ -11850,7 +11750,7 @@
       </w:pPr>
       <w:ins w:id="979" w:author="Juddy Tatiana Vargas Santofimio" w:date="2026-09-01T15:41:00Z">
         <w:r>
-          <w:t>RF-04 — torneos favoritos.</w:t>
+          <w:t>Exploración y consulta de torneos.</w:t>
         </w:r>
       </w:ins>
     </w:p>
@@ -12199,70 +12099,6 @@
         </w:tc>
       </w:tr>
       <w:tr>
-        <w:trPr>
-          <w:cnfStyle w:val="000000100000" w:firstRow="0" w:lastRow="0" w:firstColumn="0" w:lastColumn="0" w:oddVBand="0" w:evenVBand="0" w:oddHBand="1" w:evenHBand="0" w:firstRowFirstColumn="0" w:firstRowLastColumn="0" w:lastRowFirstColumn="0" w:lastRowLastColumn="0"/>
-          <w:ins w:id="1025" w:author="Juddy Tatiana Vargas Santofimio" w:date="2026-09-01T15:42:00Z"/>
-        </w:trPr>
-        <w:tc>
-          <w:tcPr>
-            <w:tcW w:w="5443" w:type="dxa"/>
-            <w:tcPrChange w:id="1026" w:author="Juddy Tatiana Vargas Santofimio" w:date="2026-09-13T15:00:00Z">
-              <w:tcPr>
-                <w:tcW w:w="5669" w:type="dxa"/>
-                <w:gridSpan w:val="2"/>
-              </w:tcPr>
-            </w:tcPrChange>
-          </w:tcPr>
-          <w:p>
-            <w:pPr>
-              <w:cnfStyle w:val="000000100000" w:firstRow="0" w:lastRow="0" w:firstColumn="0" w:lastColumn="0" w:oddVBand="0" w:evenVBand="0" w:oddHBand="1" w:evenHBand="0" w:firstRowFirstColumn="0" w:firstRowLastColumn="0" w:lastRowFirstColumn="0" w:lastRowLastColumn="0"/>
-              <w:rPr>
-                <w:ins w:id="1027" w:author="Juddy Tatiana Vargas Santofimio" w:date="2026-09-01T15:42:00Z"/>
-              </w:rPr>
-              <w:pPrChange w:id="1028" w:author="Juddy Tatiana Vargas Santofimio" w:date="2026-09-01T15:42:00Z">
-                <w:pPr>
-                  <w:cnfStyle w:val="000000100000" w:firstRow="0" w:lastRow="0" w:firstColumn="0" w:lastColumn="0" w:oddVBand="0" w:evenVBand="0" w:oddHBand="1" w:evenHBand="0" w:firstRowFirstColumn="0" w:firstRowLastColumn="0" w:lastRowFirstColumn="0" w:lastRowLastColumn="0"/>
-                </w:pPr>
-              </w:pPrChange>
-            </w:pPr>
-            <w:ins w:id="1029" w:author="Juddy Tatiana Vargas Santofimio" w:date="2026-09-01T15:42:00Z">
-              <w:r>
-                <w:t>Mis torneos / Torneos favoritos</w:t>
-              </w:r>
-            </w:ins>
-          </w:p>
-        </w:tc>
-        <w:tc>
-          <w:tcPr>
-            <w:tcW w:w="2619" w:type="dxa"/>
-            <w:tcPrChange w:id="1030" w:author="Juddy Tatiana Vargas Santofimio" w:date="2026-09-13T15:00:00Z">
-              <w:tcPr>
-                <w:tcW w:w="2619" w:type="dxa"/>
-                <w:gridSpan w:val="2"/>
-              </w:tcPr>
-            </w:tcPrChange>
-          </w:tcPr>
-          <w:p>
-            <w:pPr>
-              <w:cnfStyle w:val="000000100000" w:firstRow="0" w:lastRow="0" w:firstColumn="0" w:lastColumn="0" w:oddVBand="0" w:evenVBand="0" w:oddHBand="1" w:evenHBand="0" w:firstRowFirstColumn="0" w:firstRowLastColumn="0" w:lastRowFirstColumn="0" w:lastRowLastColumn="0"/>
-              <w:rPr>
-                <w:ins w:id="1031" w:author="Juddy Tatiana Vargas Santofimio" w:date="2026-09-01T15:42:00Z"/>
-              </w:rPr>
-              <w:pPrChange w:id="1032" w:author="Juddy Tatiana Vargas Santofimio" w:date="2026-09-01T15:42:00Z">
-                <w:pPr>
-                  <w:cnfStyle w:val="000000100000" w:firstRow="0" w:lastRow="0" w:firstColumn="0" w:lastColumn="0" w:oddVBand="0" w:evenVBand="0" w:oddHBand="1" w:evenHBand="0" w:firstRowFirstColumn="0" w:firstRowLastColumn="0" w:lastRowFirstColumn="0" w:lastRowLastColumn="0"/>
-                </w:pPr>
-              </w:pPrChange>
-            </w:pPr>
-            <w:ins w:id="1033" w:author="Juddy Tatiana Vargas Santofimio" w:date="2026-09-01T15:42:00Z">
-              <w:r>
-                <w:t>UC-01, UC-10</w:t>
-              </w:r>
-            </w:ins>
-          </w:p>
-        </w:tc>
-      </w:tr>
-      <w:tr>
         <w:tblPrEx>
           <w:tblPrExChange w:id="1034" w:author="Juddy Tatiana Vargas Santofimio" w:date="2026-09-13T15:00:00Z">
             <w:tblPrEx>
@@ -13345,7 +13181,7 @@
           <w:ins w:id="1179" w:author="Juddy Tatiana Vargas Santofimio" w:date="2026-09-01T16:26:00Z"/>
         </w:rPr>
         <w:sectPr>
-          <w:footerReference w:type="first" r:id="rId14"/>
+          <w:footerReference w:type="first" ns10:id="rId14"/>
           <w:pgSz w:w="12240" w:h="15840"/>
           <w:pgMar w:top="1417" w:right="1701" w:bottom="1417" w:left="1701" w:header="708" w:footer="708" w:gutter="0"/>
           <w:cols w:space="708"/>
@@ -15525,203 +15361,6 @@
       </w:tr>
       <w:tr>
         <w:trPr>
-          <w:cnfStyle w:val="000000010000" w:firstRow="0" w:lastRow="0" w:firstColumn="0" w:lastColumn="0" w:oddVBand="0" w:evenVBand="0" w:oddHBand="0" w:evenHBand="1" w:firstRowFirstColumn="0" w:firstRowLastColumn="0" w:lastRowFirstColumn="0" w:lastRowLastColumn="0"/>
-        </w:trPr>
-        <w:tc>
-          <w:tcPr>
-            <w:cnfStyle w:val="001000000000" w:firstRow="0" w:lastRow="0" w:firstColumn="1" w:lastColumn="0" w:oddVBand="0" w:evenVBand="0" w:oddHBand="0" w:evenHBand="0" w:firstRowFirstColumn="0" w:firstRowLastColumn="0" w:lastRowFirstColumn="0" w:lastRowLastColumn="0"/>
-            <w:tcW w:w="4309" w:type="dxa"/>
-            <w:tcPrChange w:id="1329" w:author="Juddy Tatiana Vargas Santofimio" w:date="2026-09-13T15:00:00Z">
-              <w:tcPr>
-                <w:tcW w:w="4309" w:type="dxa"/>
-                <w:shd w:val="clear" w:color="auto" w:fill="auto"/>
-                <w:tcMar>
-                  <w:top w:w="80" w:type="dxa"/>
-                  <w:left w:w="100" w:type="dxa"/>
-                  <w:bottom w:w="80" w:type="dxa"/>
-                  <w:right w:w="100" w:type="dxa"/>
-                </w:tcMar>
-                <w:vAlign w:val="center"/>
-              </w:tcPr>
-            </w:tcPrChange>
-          </w:tcPr>
-          <w:p>
-            <w:pPr>
-              <w:cnfStyle w:val="001000010000" w:firstRow="0" w:lastRow="0" w:firstColumn="1" w:lastColumn="0" w:oddVBand="0" w:evenVBand="0" w:oddHBand="0" w:evenHBand="1" w:firstRowFirstColumn="0" w:firstRowLastColumn="0" w:lastRowFirstColumn="0" w:lastRowLastColumn="0"/>
-              <w:pPrChange w:id="1330" w:author="Juddy Tatiana Vargas Santofimio" w:date="2026-09-13T14:47:00Z">
-                <w:pPr>
-                  <w:cnfStyle w:val="001000010000" w:firstRow="0" w:lastRow="0" w:firstColumn="1" w:lastColumn="0" w:oddVBand="0" w:evenVBand="0" w:oddHBand="0" w:evenHBand="1" w:firstRowFirstColumn="0" w:firstRowLastColumn="0" w:lastRowFirstColumn="0" w:lastRowLastColumn="0"/>
-                </w:pPr>
-              </w:pPrChange>
-            </w:pPr>
-            <w:r>
-              <w:t>UC-10 Marcar torneo como favorito</w:t>
-            </w:r>
-          </w:p>
-        </w:tc>
-        <w:tc>
-          <w:tcPr>
-            <w:tcW w:w="862" w:type="dxa"/>
-            <w:tcPrChange w:id="1331" w:author="Juddy Tatiana Vargas Santofimio" w:date="2026-09-13T15:00:00Z">
-              <w:tcPr>
-                <w:tcW w:w="862" w:type="dxa"/>
-                <w:gridSpan w:val="2"/>
-                <w:shd w:val="clear" w:color="auto" w:fill="auto"/>
-                <w:tcMar>
-                  <w:top w:w="80" w:type="dxa"/>
-                  <w:left w:w="100" w:type="dxa"/>
-                  <w:bottom w:w="80" w:type="dxa"/>
-                  <w:right w:w="100" w:type="dxa"/>
-                </w:tcMar>
-                <w:vAlign w:val="center"/>
-              </w:tcPr>
-            </w:tcPrChange>
-          </w:tcPr>
-          <w:p>
-            <w:pPr>
-              <w:cnfStyle w:val="000000010000" w:firstRow="0" w:lastRow="0" w:firstColumn="0" w:lastColumn="0" w:oddVBand="0" w:evenVBand="0" w:oddHBand="0" w:evenHBand="1" w:firstRowFirstColumn="0" w:firstRowLastColumn="0" w:lastRowFirstColumn="0" w:lastRowLastColumn="0"/>
-              <w:pPrChange w:id="1332" w:author="Juddy Tatiana Vargas Santofimio" w:date="2026-09-13T14:47:00Z">
-                <w:pPr>
-                  <w:cnfStyle w:val="000000010000" w:firstRow="0" w:lastRow="0" w:firstColumn="0" w:lastColumn="0" w:oddVBand="0" w:evenVBand="0" w:oddHBand="0" w:evenHBand="1" w:firstRowFirstColumn="0" w:firstRowLastColumn="0" w:lastRowFirstColumn="0" w:lastRowLastColumn="0"/>
-                </w:pPr>
-              </w:pPrChange>
-            </w:pPr>
-            <w:r>
-              <w:t>X</w:t>
-            </w:r>
-          </w:p>
-        </w:tc>
-        <w:tc>
-          <w:tcPr>
-            <w:tcW w:w="868" w:type="dxa"/>
-            <w:tcPrChange w:id="1333" w:author="Juddy Tatiana Vargas Santofimio" w:date="2026-09-13T15:00:00Z">
-              <w:tcPr>
-                <w:tcW w:w="868" w:type="dxa"/>
-                <w:gridSpan w:val="2"/>
-                <w:shd w:val="clear" w:color="auto" w:fill="auto"/>
-                <w:tcMar>
-                  <w:top w:w="80" w:type="dxa"/>
-                  <w:left w:w="100" w:type="dxa"/>
-                  <w:bottom w:w="80" w:type="dxa"/>
-                  <w:right w:w="100" w:type="dxa"/>
-                </w:tcMar>
-                <w:vAlign w:val="center"/>
-              </w:tcPr>
-            </w:tcPrChange>
-          </w:tcPr>
-          <w:p>
-            <w:pPr>
-              <w:cnfStyle w:val="000000010000" w:firstRow="0" w:lastRow="0" w:firstColumn="0" w:lastColumn="0" w:oddVBand="0" w:evenVBand="0" w:oddHBand="0" w:evenHBand="1" w:firstRowFirstColumn="0" w:firstRowLastColumn="0" w:lastRowFirstColumn="0" w:lastRowLastColumn="0"/>
-              <w:pPrChange w:id="1334" w:author="Juddy Tatiana Vargas Santofimio" w:date="2026-09-13T14:47:00Z">
-                <w:pPr>
-                  <w:cnfStyle w:val="000000010000" w:firstRow="0" w:lastRow="0" w:firstColumn="0" w:lastColumn="0" w:oddVBand="0" w:evenVBand="0" w:oddHBand="0" w:evenHBand="1" w:firstRowFirstColumn="0" w:firstRowLastColumn="0" w:lastRowFirstColumn="0" w:lastRowLastColumn="0"/>
-                </w:pPr>
-              </w:pPrChange>
-            </w:pPr>
-            <w:r>
-              <w:t>X</w:t>
-            </w:r>
-          </w:p>
-        </w:tc>
-        <w:tc>
-          <w:tcPr>
-            <w:tcW w:w="816" w:type="dxa"/>
-            <w:tcPrChange w:id="1335" w:author="Juddy Tatiana Vargas Santofimio" w:date="2026-09-13T15:00:00Z">
-              <w:tcPr>
-                <w:tcW w:w="816" w:type="dxa"/>
-                <w:gridSpan w:val="2"/>
-                <w:shd w:val="clear" w:color="auto" w:fill="auto"/>
-                <w:tcMar>
-                  <w:top w:w="80" w:type="dxa"/>
-                  <w:left w:w="100" w:type="dxa"/>
-                  <w:bottom w:w="80" w:type="dxa"/>
-                  <w:right w:w="100" w:type="dxa"/>
-                </w:tcMar>
-                <w:vAlign w:val="center"/>
-              </w:tcPr>
-            </w:tcPrChange>
-          </w:tcPr>
-          <w:p>
-            <w:pPr>
-              <w:cnfStyle w:val="000000010000" w:firstRow="0" w:lastRow="0" w:firstColumn="0" w:lastColumn="0" w:oddVBand="0" w:evenVBand="0" w:oddHBand="0" w:evenHBand="1" w:firstRowFirstColumn="0" w:firstRowLastColumn="0" w:lastRowFirstColumn="0" w:lastRowLastColumn="0"/>
-              <w:pPrChange w:id="1336" w:author="Juddy Tatiana Vargas Santofimio" w:date="2026-09-13T14:47:00Z">
-                <w:pPr>
-                  <w:cnfStyle w:val="000000010000" w:firstRow="0" w:lastRow="0" w:firstColumn="0" w:lastColumn="0" w:oddVBand="0" w:evenVBand="0" w:oddHBand="0" w:evenHBand="1" w:firstRowFirstColumn="0" w:firstRowLastColumn="0" w:lastRowFirstColumn="0" w:lastRowLastColumn="0"/>
-                </w:pPr>
-              </w:pPrChange>
-            </w:pPr>
-            <w:r>
-              <w:t>X</w:t>
-            </w:r>
-          </w:p>
-        </w:tc>
-        <w:tc>
-          <w:tcPr>
-            <w:tcW w:w="1134" w:type="dxa"/>
-            <w:tcPrChange w:id="1337" w:author="Juddy Tatiana Vargas Santofimio" w:date="2026-09-13T15:00:00Z">
-              <w:tcPr>
-                <w:tcW w:w="1134" w:type="dxa"/>
-                <w:gridSpan w:val="2"/>
-                <w:shd w:val="clear" w:color="auto" w:fill="auto"/>
-                <w:tcMar>
-                  <w:top w:w="80" w:type="dxa"/>
-                  <w:left w:w="100" w:type="dxa"/>
-                  <w:bottom w:w="80" w:type="dxa"/>
-                  <w:right w:w="100" w:type="dxa"/>
-                </w:tcMar>
-                <w:vAlign w:val="center"/>
-              </w:tcPr>
-            </w:tcPrChange>
-          </w:tcPr>
-          <w:p>
-            <w:pPr>
-              <w:cnfStyle w:val="000000010000" w:firstRow="0" w:lastRow="0" w:firstColumn="0" w:lastColumn="0" w:oddVBand="0" w:evenVBand="0" w:oddHBand="0" w:evenHBand="1" w:firstRowFirstColumn="0" w:firstRowLastColumn="0" w:lastRowFirstColumn="0" w:lastRowLastColumn="0"/>
-              <w:pPrChange w:id="1338" w:author="Juddy Tatiana Vargas Santofimio" w:date="2026-09-13T14:47:00Z">
-                <w:pPr>
-                  <w:cnfStyle w:val="000000010000" w:firstRow="0" w:lastRow="0" w:firstColumn="0" w:lastColumn="0" w:oddVBand="0" w:evenVBand="0" w:oddHBand="0" w:evenHBand="1" w:firstRowFirstColumn="0" w:firstRowLastColumn="0" w:lastRowFirstColumn="0" w:lastRowLastColumn="0"/>
-                </w:pPr>
-              </w:pPrChange>
-            </w:pPr>
-            <w:r>
-              <w:t>X</w:t>
-            </w:r>
-          </w:p>
-        </w:tc>
-        <w:tc>
-          <w:tcPr>
-            <w:tcW w:w="851" w:type="dxa"/>
-            <w:tcPrChange w:id="1339" w:author="Juddy Tatiana Vargas Santofimio" w:date="2026-09-13T15:00:00Z">
-              <w:tcPr>
-                <w:tcW w:w="851" w:type="dxa"/>
-                <w:gridSpan w:val="2"/>
-                <w:shd w:val="clear" w:color="auto" w:fill="auto"/>
-                <w:tcMar>
-                  <w:top w:w="80" w:type="dxa"/>
-                  <w:left w:w="100" w:type="dxa"/>
-                  <w:bottom w:w="80" w:type="dxa"/>
-                  <w:right w:w="100" w:type="dxa"/>
-                </w:tcMar>
-                <w:vAlign w:val="center"/>
-              </w:tcPr>
-            </w:tcPrChange>
-          </w:tcPr>
-          <w:p>
-            <w:pPr>
-              <w:cnfStyle w:val="000000010000" w:firstRow="0" w:lastRow="0" w:firstColumn="0" w:lastColumn="0" w:oddVBand="0" w:evenVBand="0" w:oddHBand="0" w:evenHBand="1" w:firstRowFirstColumn="0" w:firstRowLastColumn="0" w:lastRowFirstColumn="0" w:lastRowLastColumn="0"/>
-              <w:pPrChange w:id="1340" w:author="Juddy Tatiana Vargas Santofimio" w:date="2026-09-13T14:47:00Z">
-                <w:pPr>
-                  <w:cnfStyle w:val="000000010000" w:firstRow="0" w:lastRow="0" w:firstColumn="0" w:lastColumn="0" w:oddVBand="0" w:evenVBand="0" w:oddHBand="0" w:evenHBand="1" w:firstRowFirstColumn="0" w:firstRowLastColumn="0" w:lastRowFirstColumn="0" w:lastRowLastColumn="0"/>
-                </w:pPr>
-              </w:pPrChange>
-            </w:pPr>
-            <w:r>
-              <w:t>X</w:t>
-            </w:r>
-          </w:p>
-        </w:tc>
-      </w:tr>
-      <w:tr>
-        <w:trPr>
           <w:cnfStyle w:val="000000100000" w:firstRow="0" w:lastRow="0" w:firstColumn="0" w:lastColumn="0" w:oddVBand="0" w:evenVBand="0" w:oddHBand="1" w:evenHBand="0" w:firstRowFirstColumn="0" w:firstRowLastColumn="0" w:lastRowFirstColumn="0" w:lastRowLastColumn="0"/>
           <w:ins w:id="1341" w:author="Juddy Tatiana Vargas Santofimio" w:date="2026-08-31T19:00:00Z"/>
         </w:trPr>
@@ -21797,29 +21436,6 @@
         </w:r>
       </w:ins>
     </w:p>
-    <w:p>
-      <w:pPr>
-        <w:pStyle w:val="Ttulo3"/>
-        <w:numPr>
-          <w:ilvl w:val="0"/>
-          <w:numId w:val="53"/>
-        </w:numPr>
-        <w:rPr>
-          <w:ins w:id="2088" w:author="Juddy Tatiana Vargas Santofimio" w:date="2026-09-01T17:16:00Z"/>
-        </w:rPr>
-        <w:pPrChange w:id="2089" w:author="Juddy Tatiana Vargas Santofimio" w:date="2026-09-01T17:17:00Z">
-          <w:pPr>
-            <w:pStyle w:val="Ttulo2"/>
-            <w:spacing w:before="340" w:after="100"/>
-          </w:pPr>
-        </w:pPrChange>
-      </w:pPr>
-      <w:ins w:id="2090" w:author="Juddy Tatiana Vargas Santofimio" w:date="2026-09-01T17:16:00Z">
-        <w:r>
-          <w:t>Marcar torneo como favorito</w:t>
-        </w:r>
-      </w:ins>
-    </w:p>
     <w:tbl>
       <w:tblPr>
         <w:tblStyle w:val="Estilo1"/>
@@ -21936,86 +21552,6 @@
       </w:tr>
       <w:tr>
         <w:trPr>
-          <w:cnfStyle w:val="000000010000" w:firstRow="0" w:lastRow="0" w:firstColumn="0" w:lastColumn="0" w:oddVBand="0" w:evenVBand="0" w:oddHBand="0" w:evenHBand="1" w:firstRowFirstColumn="0" w:firstRowLastColumn="0" w:lastRowFirstColumn="0" w:lastRowLastColumn="0"/>
-          <w:ins w:id="2103" w:author="Juddy Tatiana Vargas Santofimio" w:date="2026-09-01T17:16:00Z"/>
-        </w:trPr>
-        <w:tc>
-          <w:tcPr>
-            <w:cnfStyle w:val="001000000000" w:firstRow="0" w:lastRow="0" w:firstColumn="1" w:lastColumn="0" w:oddVBand="0" w:evenVBand="0" w:oddHBand="0" w:evenHBand="0" w:firstRowFirstColumn="0" w:firstRowLastColumn="0" w:lastRowFirstColumn="0" w:lastRowLastColumn="0"/>
-            <w:tcW w:w="1701" w:type="dxa"/>
-            <w:tcPrChange w:id="2104" w:author="Juddy Tatiana Vargas Santofimio" w:date="2026-09-13T15:23:00Z">
-              <w:tcPr>
-                <w:tcW w:w="2300" w:type="dxa"/>
-                <w:shd w:val="clear" w:color="auto" w:fill="E7F3EA"/>
-                <w:tcMar>
-                  <w:top w:w="80" w:type="dxa"/>
-                  <w:left w:w="100" w:type="dxa"/>
-                  <w:bottom w:w="80" w:type="dxa"/>
-                  <w:right w:w="100" w:type="dxa"/>
-                </w:tcMar>
-              </w:tcPr>
-            </w:tcPrChange>
-          </w:tcPr>
-          <w:p>
-            <w:pPr>
-              <w:cnfStyle w:val="001000010000" w:firstRow="0" w:lastRow="0" w:firstColumn="1" w:lastColumn="0" w:oddVBand="0" w:evenVBand="0" w:oddHBand="0" w:evenHBand="1" w:firstRowFirstColumn="0" w:firstRowLastColumn="0" w:lastRowFirstColumn="0" w:lastRowLastColumn="0"/>
-              <w:rPr>
-                <w:ins w:id="2105" w:author="Juddy Tatiana Vargas Santofimio" w:date="2026-09-01T17:16:00Z"/>
-                <w:rPrChange w:id="2106" w:author="Juddy Tatiana Vargas Santofimio" w:date="2026-09-13T15:06:00Z">
-                  <w:rPr>
-                    <w:ins w:id="2107" w:author="Juddy Tatiana Vargas Santofimio" w:date="2026-09-01T17:16:00Z"/>
-                  </w:rPr>
-                </w:rPrChange>
-              </w:rPr>
-            </w:pPr>
-            <w:ins w:id="2108" w:author="Juddy Tatiana Vargas Santofimio" w:date="2026-09-01T17:16:00Z">
-              <w:r>
-                <w:rPr>
-                  <w:bCs/>
-                  <w:rPrChange w:id="2109" w:author="Juddy Tatiana Vargas Santofimio" w:date="2026-09-13T15:06:00Z">
-                    <w:rPr>
-                      <w:b w:val="0"/>
-                      <w:bCs/>
-                    </w:rPr>
-                  </w:rPrChange>
-                </w:rPr>
-                <w:t>Requerimientos</w:t>
-              </w:r>
-            </w:ins>
-          </w:p>
-        </w:tc>
-        <w:tc>
-          <w:tcPr>
-            <w:tcW w:w="7143" w:type="dxa"/>
-            <w:tcPrChange w:id="2110" w:author="Juddy Tatiana Vargas Santofimio" w:date="2026-09-13T15:23:00Z">
-              <w:tcPr>
-                <w:tcW w:w="6660" w:type="dxa"/>
-                <w:tcMar>
-                  <w:top w:w="80" w:type="dxa"/>
-                  <w:left w:w="100" w:type="dxa"/>
-                  <w:bottom w:w="80" w:type="dxa"/>
-                  <w:right w:w="100" w:type="dxa"/>
-                </w:tcMar>
-              </w:tcPr>
-            </w:tcPrChange>
-          </w:tcPr>
-          <w:p>
-            <w:pPr>
-              <w:cnfStyle w:val="000000010000" w:firstRow="0" w:lastRow="0" w:firstColumn="0" w:lastColumn="0" w:oddVBand="0" w:evenVBand="0" w:oddHBand="0" w:evenHBand="1" w:firstRowFirstColumn="0" w:firstRowLastColumn="0" w:lastRowFirstColumn="0" w:lastRowLastColumn="0"/>
-              <w:rPr>
-                <w:ins w:id="2111" w:author="Juddy Tatiana Vargas Santofimio" w:date="2026-09-01T17:16:00Z"/>
-              </w:rPr>
-            </w:pPr>
-            <w:ins w:id="2112" w:author="Juddy Tatiana Vargas Santofimio" w:date="2026-09-01T17:16:00Z">
-              <w:r>
-                <w:t>RF-04</w:t>
-              </w:r>
-            </w:ins>
-          </w:p>
-        </w:tc>
-      </w:tr>
-      <w:tr>
-        <w:trPr>
           <w:cnfStyle w:val="000000100000" w:firstRow="0" w:lastRow="0" w:firstColumn="0" w:lastColumn="0" w:oddVBand="0" w:evenVBand="0" w:oddHBand="1" w:evenHBand="0" w:firstRowFirstColumn="0" w:firstRowLastColumn="0" w:lastRowFirstColumn="0" w:lastRowLastColumn="0"/>
           <w:ins w:id="2113" w:author="Juddy Tatiana Vargas Santofimio" w:date="2026-09-01T17:16:00Z"/>
         </w:trPr>
@@ -22094,104 +21630,6 @@
           </w:p>
         </w:tc>
       </w:tr>
-      <w:tr>
-        <w:trPr>
-          <w:cnfStyle w:val="000000010000" w:firstRow="0" w:lastRow="0" w:firstColumn="0" w:lastColumn="0" w:oddVBand="0" w:evenVBand="0" w:oddHBand="0" w:evenHBand="1" w:firstRowFirstColumn="0" w:firstRowLastColumn="0" w:lastRowFirstColumn="0" w:lastRowLastColumn="0"/>
-          <w:ins w:id="2123" w:author="Juddy Tatiana Vargas Santofimio" w:date="2026-09-01T17:16:00Z"/>
-        </w:trPr>
-        <w:tc>
-          <w:tcPr>
-            <w:cnfStyle w:val="001000000000" w:firstRow="0" w:lastRow="0" w:firstColumn="1" w:lastColumn="0" w:oddVBand="0" w:evenVBand="0" w:oddHBand="0" w:evenHBand="0" w:firstRowFirstColumn="0" w:firstRowLastColumn="0" w:lastRowFirstColumn="0" w:lastRowLastColumn="0"/>
-            <w:tcW w:w="1701" w:type="dxa"/>
-            <w:tcPrChange w:id="2124" w:author="Juddy Tatiana Vargas Santofimio" w:date="2026-09-13T15:23:00Z">
-              <w:tcPr>
-                <w:tcW w:w="2300" w:type="dxa"/>
-                <w:shd w:val="clear" w:color="auto" w:fill="E7F3EA"/>
-                <w:tcMar>
-                  <w:top w:w="80" w:type="dxa"/>
-                  <w:left w:w="100" w:type="dxa"/>
-                  <w:bottom w:w="80" w:type="dxa"/>
-                  <w:right w:w="100" w:type="dxa"/>
-                </w:tcMar>
-              </w:tcPr>
-            </w:tcPrChange>
-          </w:tcPr>
-          <w:p>
-            <w:pPr>
-              <w:cnfStyle w:val="001000010000" w:firstRow="0" w:lastRow="0" w:firstColumn="1" w:lastColumn="0" w:oddVBand="0" w:evenVBand="0" w:oddHBand="0" w:evenHBand="1" w:firstRowFirstColumn="0" w:firstRowLastColumn="0" w:lastRowFirstColumn="0" w:lastRowLastColumn="0"/>
-              <w:rPr>
-                <w:ins w:id="2125" w:author="Juddy Tatiana Vargas Santofimio" w:date="2026-09-01T17:16:00Z"/>
-                <w:rPrChange w:id="2126" w:author="Juddy Tatiana Vargas Santofimio" w:date="2026-09-13T15:06:00Z">
-                  <w:rPr>
-                    <w:ins w:id="2127" w:author="Juddy Tatiana Vargas Santofimio" w:date="2026-09-01T17:16:00Z"/>
-                  </w:rPr>
-                </w:rPrChange>
-              </w:rPr>
-            </w:pPr>
-            <w:ins w:id="2128" w:author="Juddy Tatiana Vargas Santofimio" w:date="2026-09-01T17:16:00Z">
-              <w:r>
-                <w:rPr>
-                  <w:bCs/>
-                  <w:rPrChange w:id="2129" w:author="Juddy Tatiana Vargas Santofimio" w:date="2026-09-13T15:06:00Z">
-                    <w:rPr>
-                      <w:b w:val="0"/>
-                      <w:bCs/>
-                    </w:rPr>
-                  </w:rPrChange>
-                </w:rPr>
-                <w:t>Disparador</w:t>
-              </w:r>
-            </w:ins>
-          </w:p>
-        </w:tc>
-        <w:tc>
-          <w:tcPr>
-            <w:tcW w:w="7143" w:type="dxa"/>
-            <w:tcPrChange w:id="2130" w:author="Juddy Tatiana Vargas Santofimio" w:date="2026-09-13T15:23:00Z">
-              <w:tcPr>
-                <w:tcW w:w="6660" w:type="dxa"/>
-                <w:tcMar>
-                  <w:top w:w="80" w:type="dxa"/>
-                  <w:left w:w="100" w:type="dxa"/>
-                  <w:bottom w:w="80" w:type="dxa"/>
-                  <w:right w:w="100" w:type="dxa"/>
-                </w:tcMar>
-              </w:tcPr>
-            </w:tcPrChange>
-          </w:tcPr>
-          <w:p>
-            <w:pPr>
-              <w:cnfStyle w:val="000000010000" w:firstRow="0" w:lastRow="0" w:firstColumn="0" w:lastColumn="0" w:oddVBand="0" w:evenVBand="0" w:oddHBand="0" w:evenHBand="1" w:firstRowFirstColumn="0" w:firstRowLastColumn="0" w:lastRowFirstColumn="0" w:lastRowLastColumn="0"/>
-              <w:rPr>
-                <w:ins w:id="2131" w:author="Juddy Tatiana Vargas Santofimio" w:date="2026-09-01T17:16:00Z"/>
-              </w:rPr>
-            </w:pPr>
-            <w:ins w:id="2132" w:author="Juddy Tatiana Vargas Santofimio" w:date="2026-09-01T17:16:00Z">
-              <w:r>
-                <w:t>El usuario pulsa el ícono de estrella (</w:t>
-              </w:r>
-              <w:r>
-                <w:rPr>
-                  <w:rFonts w:ascii="Segoe UI Symbol" w:hAnsi="Segoe UI Symbol" w:cs="Segoe UI Symbol"/>
-                </w:rPr>
-                <w:t>★</w:t>
-              </w:r>
-              <w:r>
-                <w:t xml:space="preserve"> / </w:t>
-              </w:r>
-              <w:r>
-                <w:rPr>
-                  <w:rFonts w:ascii="Segoe UI Symbol" w:hAnsi="Segoe UI Symbol" w:cs="Segoe UI Symbol"/>
-                </w:rPr>
-                <w:t>☆</w:t>
-              </w:r>
-              <w:r>
-                <w:t>) sobre un torneo en "Mis torneos".</w:t>
-              </w:r>
-            </w:ins>
-          </w:p>
-        </w:tc>
-      </w:tr>
     </w:tbl>
     <w:p>
       <w:pPr>
@@ -22207,72 +21645,6 @@
             <w:bCs/>
           </w:rPr>
           <w:t>Flujo principal</w:t>
-        </w:r>
-      </w:ins>
-    </w:p>
-    <w:p>
-      <w:pPr>
-        <w:pStyle w:val="Prrafodelista"/>
-        <w:numPr>
-          <w:ilvl w:val="0"/>
-          <w:numId w:val="71"/>
-        </w:numPr>
-        <w:spacing w:after="60"/>
-        <w:rPr>
-          <w:ins w:id="2135" w:author="Juddy Tatiana Vargas Santofimio" w:date="2026-09-01T17:16:00Z"/>
-        </w:rPr>
-        <w:pPrChange w:id="2136" w:author="Juddy Tatiana Vargas Santofimio" w:date="2026-09-01T17:17:00Z">
-          <w:pPr>
-            <w:spacing w:after="60"/>
-            <w:ind w:left="260" w:hanging="260"/>
-          </w:pPr>
-        </w:pPrChange>
-      </w:pPr>
-      <w:ins w:id="2137" w:author="Juddy Tatiana Vargas Santofimio" w:date="2026-09-01T17:16:00Z">
-        <w:r>
-          <w:t>El usuario pulsa la estrella vacía (</w:t>
-        </w:r>
-        <w:r>
-          <w:rPr>
-            <w:rFonts w:ascii="Segoe UI Symbol" w:hAnsi="Segoe UI Symbol" w:cs="Segoe UI Symbol"/>
-          </w:rPr>
-          <w:t>☆</w:t>
-        </w:r>
-        <w:r>
-          <w:t>) junto a un torneo.</w:t>
-        </w:r>
-      </w:ins>
-    </w:p>
-    <w:p>
-      <w:pPr>
-        <w:pStyle w:val="Prrafodelista"/>
-        <w:numPr>
-          <w:ilvl w:val="0"/>
-          <w:numId w:val="71"/>
-        </w:numPr>
-        <w:spacing w:after="60"/>
-        <w:rPr>
-          <w:ins w:id="2138" w:author="Juddy Tatiana Vargas Santofimio" w:date="2026-09-01T17:16:00Z"/>
-        </w:rPr>
-        <w:pPrChange w:id="2139" w:author="Juddy Tatiana Vargas Santofimio" w:date="2026-09-01T17:17:00Z">
-          <w:pPr>
-            <w:spacing w:after="60"/>
-            <w:ind w:left="260" w:hanging="260"/>
-          </w:pPr>
-        </w:pPrChange>
-      </w:pPr>
-      <w:ins w:id="2140" w:author="Juddy Tatiana Vargas Santofimio" w:date="2026-09-01T17:16:00Z">
-        <w:r>
-          <w:t>El sistema marca el torneo como favorito y lo resalta con estrella llena (</w:t>
-        </w:r>
-        <w:r>
-          <w:rPr>
-            <w:rFonts w:ascii="Segoe UI Symbol" w:hAnsi="Segoe UI Symbol" w:cs="Segoe UI Symbol"/>
-          </w:rPr>
-          <w:t>★</w:t>
-        </w:r>
-        <w:r>
-          <w:t>).</w:t>
         </w:r>
       </w:ins>
     </w:p>
@@ -22296,7 +21668,7 @@
       </w:pPr>
       <w:ins w:id="2143" w:author="Juddy Tatiana Vargas Santofimio" w:date="2026-09-01T17:16:00Z">
         <w:r>
-          <w:t>El torneo queda accesible desde la vista "Torneos favoritos", con su resumen de posiciones y destacados.</w:t>
+          <w:t>El torneo queda accesible desde la vista "Explorar torneos", con su resumen de posiciones y destacados.</w:t>
         </w:r>
       </w:ins>
     </w:p>
@@ -22319,54 +21691,6 @@
     </w:p>
     <w:p>
       <w:pPr>
-        <w:pStyle w:val="Prrafodelista"/>
-        <w:numPr>
-          <w:ilvl w:val="0"/>
-          <w:numId w:val="72"/>
-        </w:numPr>
-        <w:spacing w:after="60" w:line="240" w:lineRule="auto"/>
-        <w:contextualSpacing w:val="0"/>
-        <w:rPr>
-          <w:ins w:id="2146" w:author="Juddy Tatiana Vargas Santofimio" w:date="2026-09-01T17:16:00Z"/>
-        </w:rPr>
-        <w:pPrChange w:id="2147" w:author="Juddy Tatiana Vargas Santofimio" w:date="2026-09-01T17:17:00Z">
-          <w:pPr>
-            <w:pStyle w:val="Prrafodelista"/>
-            <w:numPr>
-              <w:numId w:val="70"/>
-            </w:numPr>
-            <w:spacing w:after="60" w:line="240" w:lineRule="auto"/>
-            <w:ind w:left="260" w:hanging="260"/>
-            <w:contextualSpacing w:val="0"/>
-          </w:pPr>
-        </w:pPrChange>
-      </w:pPr>
-      <w:ins w:id="2148" w:author="Juddy Tatiana Vargas Santofimio" w:date="2026-09-01T17:16:00Z">
-        <w:r>
-          <w:t>1a. El usuario pulsa una estrella ya llena (</w:t>
-        </w:r>
-        <w:r>
-          <w:rPr>
-            <w:rFonts w:ascii="Segoe UI Symbol" w:hAnsi="Segoe UI Symbol" w:cs="Segoe UI Symbol"/>
-          </w:rPr>
-          <w:t>★</w:t>
-        </w:r>
-        <w:r>
-          <w:t xml:space="preserve">) </w:t>
-        </w:r>
-        <w:r>
-          <w:rPr>
-            <w:rFonts w:cs="Franklin Gothic Book"/>
-          </w:rPr>
-          <w:t>→</w:t>
-        </w:r>
-        <w:r>
-          <w:t xml:space="preserve"> el sistema quita el torneo de favoritos.</w:t>
-        </w:r>
-      </w:ins>
-    </w:p>
-    <w:p>
-      <w:pPr>
         <w:spacing w:before="140" w:after="60"/>
         <w:rPr>
           <w:ins w:id="2149" w:author="Juddy Tatiana Vargas Santofimio" w:date="2026-09-01T17:16:00Z"/>
@@ -22393,7 +21717,7 @@
       </w:pPr>
       <w:ins w:id="2152" w:author="Juddy Tatiana Vargas Santofimio" w:date="2026-09-01T17:16:00Z">
         <w:r>
-          <w:t>La lista de torneos favoritos del usuario queda actualizada.</w:t>
+          <w:t>La lista de torneos disponibles del usuario queda actualizada.</w:t>
         </w:r>
       </w:ins>
     </w:p>

</xml_diff>